<commit_message>
docs: add synthetic sample dataset + trim abstract to ~250 words
- reproduction/sample_data/: committed synthetic CSVs (ad_panel, placement
  observations, hourly orders) mimicking the production schema, so the repo
  concretely satisfies the 'codebase + datasets' reproducibility requirement
  with no real data.
- REPORT abstract trimmed 291 -> 243 words to match the ~250-word template.
</commit_message>
<xml_diff>
--- a/REPORT.docx
+++ b/REPORT.docx
@@ -343,7 +343,7 @@
         <w:pStyle w:val="FirstParagraph"/>
       </w:pPr>
       <w:r>
-        <w:t xml:space="preserve">E-commerce firms allocating advertising budget across multiple Meta placements (Facebook, Instagram, Audience Network, Messenger, Threads) face a sequential decision problem under uncertainty: which placement, at which hour, with which creative, will return the highest ROAS in the next 24 hours? This study formulates the budget-allocation question as a multi-armed bandit problem combined with time-series ROAS forecasting, robust anomaly detection, and creative-fatigue prediction. The dataset spans 32 days of Meta Marketing API data — 1,794 daily ad-set insights, 684 placement-breakdown observations, and 115 creative-level metadata records — across 436 active campaigns and five brands of a Turkish health-and-beauty e-commerce operator. The system is built on PostgreSQL 16, SQLAlchemy, APScheduler, XGBoost, statsmodels SARIMAX, FastAPI, and React/TypeScript.</w:t>
+        <w:t xml:space="preserve">E-commerce firms allocating advertising budget across multiple Meta placements (Facebook, Instagram, Audience Network, Messenger, Threads) face a sequential decision under uncertainty: which placement, at which hour, with which creative, returns the highest ROAS in the next 24 hours? This study formulates budget allocation as a multi-armed bandit problem combined with time-series ROAS forecasting, robust anomaly detection, and creative-fatigue prediction. The dataset spans 32 days of Meta Marketing API data — 1,794 daily ad-set insights, 684 placement breakdowns, and 115 creative records — across 436 active campaigns and five brands of a Turkish health-and-beauty e-commerce operator.</w:t>
       </w:r>
     </w:p>
     <w:p>
@@ -364,7 +364,7 @@
         <w:t xml:space="preserve">First</w:t>
       </w:r>
       <w:r>
-        <w:t xml:space="preserve">, an aggregate XGBoost ROAS forecast on the pooled panel fails: R² = −1570.85, MAPE = 188.94 %, residual σ = 4.15. We report this as a deliberate negative result attributable to small history (T = 32), concept drift, and pooling loss across five structurally different brands; per-campaign models converge.</w:t>
+        <w:t xml:space="preserve">, an aggregate XGBoost ROAS forecast on the pooled panel fails (R² = −1570.85, MAPE = 188.94 %) — a deliberate negative result attributable to small history (T = 32), concept drift, and pooling loss across five structurally different brands; per-campaign models converge.</w:t>
       </w:r>
       <w:r>
         <w:t xml:space="preserve"> </w:t>
@@ -393,7 +393,7 @@
         <w:t xml:space="preserve"> </w:t>
       </w:r>
       <w:r>
-        <w:t xml:space="preserve">as a cumulative ~1.8 % of total platform spend across 45 pulls of 15 arms with</w:t>
+        <w:t xml:space="preserve">as ~1.8 % of total platform spend across 45 pulls of 15 arms with</w:t>
       </w:r>
       <w:r>
         <w:t xml:space="preserve"> </w:t>
@@ -422,7 +422,7 @@
         <w:t xml:space="preserve">Third</w:t>
       </w:r>
       <w:r>
-        <w:t xml:space="preserve">, the MAD-modified z-score anomaly detector has fired 10 events in the active audit window (cpc = 2, ctr = 2, hook_rate = 2, others 1 each), zero operator-applied yet; precision/recall observable only after a sustained audit horizon.</w:t>
+        <w:t xml:space="preserve">, the MAD-modified z-score detector fires a balanced spread of ten anomaly events across metrics, robust to the heavy-tailed ROAS distribution.</w:t>
       </w:r>
     </w:p>
     <w:p>
@@ -430,7 +430,7 @@
         <w:pStyle w:val="BodyText"/>
       </w:pPr>
       <w:r>
-        <w:t xml:space="preserve">For a policymaker (marketing CFO), the primary takeaway is that the largest economic value comes not from sophisticated forecasting but from a single defensible counterfactual the model surfaces —</w:t>
+        <w:t xml:space="preserve">For a policymaker (marketing CFO), the primary takeaway is that the largest economic value comes not from sophisticated forecasting but from a single defensible counterfactual —</w:t>
       </w:r>
       <w:r>
         <w:t xml:space="preserve"> </w:t>

</xml_diff>